<commit_message>
incorporando as correções propostas pela banca;
</commit_message>
<xml_diff>
--- a/FINAL.docx
+++ b/FINAL.docx
@@ -2171,7 +2171,7 @@
                 <w:noProof/>
                 <w:webHidden/>
               </w:rPr>
-              <w:t>10</w:t>
+              <w:t>9</w:t>
             </w:r>
             <w:r>
               <w:rPr>
@@ -2527,7 +2527,7 @@
                 <w:noProof/>
                 <w:webHidden/>
               </w:rPr>
-              <w:t>13</w:t>
+              <w:t>12</w:t>
             </w:r>
             <w:r>
               <w:rPr>
@@ -3427,7 +3427,7 @@
                 <w:noProof/>
                 <w:webHidden/>
               </w:rPr>
-              <w:t>25</w:t>
+              <w:t>24</w:t>
             </w:r>
             <w:r>
               <w:rPr>
@@ -3517,7 +3517,7 @@
                 <w:noProof/>
                 <w:webHidden/>
               </w:rPr>
-              <w:t>26</w:t>
+              <w:t>25</w:t>
             </w:r>
             <w:r>
               <w:rPr>
@@ -3607,7 +3607,7 @@
                 <w:noProof/>
                 <w:webHidden/>
               </w:rPr>
-              <w:t>27</w:t>
+              <w:t>26</w:t>
             </w:r>
             <w:r>
               <w:rPr>
@@ -3787,7 +3787,7 @@
                 <w:noProof/>
                 <w:webHidden/>
               </w:rPr>
-              <w:t>35</w:t>
+              <w:t>34</w:t>
             </w:r>
             <w:r>
               <w:rPr>
@@ -3873,7 +3873,7 @@
                 <w:noProof/>
                 <w:webHidden/>
               </w:rPr>
-              <w:t>36</w:t>
+              <w:t>35</w:t>
             </w:r>
             <w:r>
               <w:rPr>
@@ -3963,7 +3963,7 @@
                 <w:noProof/>
                 <w:webHidden/>
               </w:rPr>
-              <w:t>37</w:t>
+              <w:t>36</w:t>
             </w:r>
             <w:r>
               <w:rPr>
@@ -4053,7 +4053,7 @@
                 <w:noProof/>
                 <w:webHidden/>
               </w:rPr>
-              <w:t>41</w:t>
+              <w:t>40</w:t>
             </w:r>
             <w:r>
               <w:rPr>
@@ -4143,7 +4143,7 @@
                 <w:noProof/>
                 <w:webHidden/>
               </w:rPr>
-              <w:t>44</w:t>
+              <w:t>43</w:t>
             </w:r>
             <w:r>
               <w:rPr>
@@ -4233,7 +4233,7 @@
                 <w:noProof/>
                 <w:webHidden/>
               </w:rPr>
-              <w:t>45</w:t>
+              <w:t>44</w:t>
             </w:r>
             <w:r>
               <w:rPr>
@@ -4319,7 +4319,7 @@
                 <w:noProof/>
                 <w:webHidden/>
               </w:rPr>
-              <w:t>47</w:t>
+              <w:t>46</w:t>
             </w:r>
             <w:r>
               <w:rPr>
@@ -4409,7 +4409,7 @@
                 <w:noProof/>
                 <w:webHidden/>
               </w:rPr>
-              <w:t>47</w:t>
+              <w:t>46</w:t>
             </w:r>
             <w:r>
               <w:rPr>
@@ -4499,7 +4499,7 @@
                 <w:noProof/>
                 <w:webHidden/>
               </w:rPr>
-              <w:t>48</w:t>
+              <w:t>47</w:t>
             </w:r>
             <w:r>
               <w:rPr>
@@ -4589,7 +4589,7 @@
                 <w:noProof/>
                 <w:webHidden/>
               </w:rPr>
-              <w:t>50</w:t>
+              <w:t>49</w:t>
             </w:r>
             <w:r>
               <w:rPr>
@@ -4687,7 +4687,7 @@
                 <w:noProof/>
                 <w:webHidden/>
               </w:rPr>
-              <w:t>51</w:t>
+              <w:t>50</w:t>
             </w:r>
             <w:r>
               <w:rPr>
@@ -4777,7 +4777,7 @@
                 <w:noProof/>
                 <w:webHidden/>
               </w:rPr>
-              <w:t>55</w:t>
+              <w:t>54</w:t>
             </w:r>
             <w:r>
               <w:rPr>
@@ -4867,7 +4867,7 @@
                 <w:noProof/>
                 <w:webHidden/>
               </w:rPr>
-              <w:t>57</w:t>
+              <w:t>56</w:t>
             </w:r>
             <w:r>
               <w:rPr>
@@ -4957,7 +4957,7 @@
                 <w:noProof/>
                 <w:webHidden/>
               </w:rPr>
-              <w:t>59</w:t>
+              <w:t>58</w:t>
             </w:r>
             <w:r>
               <w:rPr>
@@ -5047,7 +5047,7 @@
                 <w:noProof/>
                 <w:webHidden/>
               </w:rPr>
-              <w:t>63</w:t>
+              <w:t>62</w:t>
             </w:r>
             <w:r>
               <w:rPr>
@@ -5137,7 +5137,7 @@
                 <w:noProof/>
                 <w:webHidden/>
               </w:rPr>
-              <w:t>68</w:t>
+              <w:t>66</w:t>
             </w:r>
             <w:r>
               <w:rPr>
@@ -5227,7 +5227,7 @@
                 <w:noProof/>
                 <w:webHidden/>
               </w:rPr>
-              <w:t>70</w:t>
+              <w:t>68</w:t>
             </w:r>
             <w:r>
               <w:rPr>
@@ -5317,7 +5317,7 @@
                 <w:noProof/>
                 <w:webHidden/>
               </w:rPr>
-              <w:t>71</w:t>
+              <w:t>69</w:t>
             </w:r>
             <w:r>
               <w:rPr>
@@ -5407,7 +5407,7 @@
                 <w:noProof/>
                 <w:webHidden/>
               </w:rPr>
-              <w:t>72</w:t>
+              <w:t>71</w:t>
             </w:r>
             <w:r>
               <w:rPr>
@@ -5493,7 +5493,7 @@
                 <w:noProof/>
                 <w:webHidden/>
               </w:rPr>
-              <w:t>76</w:t>
+              <w:t>75</w:t>
             </w:r>
             <w:r>
               <w:rPr>
@@ -5579,7 +5579,7 @@
                 <w:noProof/>
                 <w:webHidden/>
               </w:rPr>
-              <w:t>79</w:t>
+              <w:t>77</w:t>
             </w:r>
             <w:r>
               <w:rPr>
@@ -5669,7 +5669,7 @@
                 <w:noProof/>
                 <w:webHidden/>
               </w:rPr>
-              <w:t>80</w:t>
+              <w:t>78</w:t>
             </w:r>
             <w:r>
               <w:rPr>
@@ -5755,7 +5755,7 @@
                 <w:noProof/>
                 <w:webHidden/>
               </w:rPr>
-              <w:t>81</w:t>
+              <w:t>79</w:t>
             </w:r>
             <w:r>
               <w:rPr>
@@ -5824,7 +5824,7 @@
                 <w:noProof/>
                 <w:webHidden/>
               </w:rPr>
-              <w:t>95</w:t>
+              <w:t>93</w:t>
             </w:r>
             <w:r>
               <w:rPr>
@@ -6844,7 +6844,7 @@
         </w:rPr>
         <w:lastRenderedPageBreak/>
         <w:drawing>
-          <wp:inline distT="0" distB="0" distL="0" distR="0">
+          <wp:inline distT="0" distB="0" distL="0" distR="0" wp14:anchorId="76AA1513" wp14:editId="75F77468">
             <wp:extent cx="5943600" cy="915314"/>
             <wp:effectExtent l="0" t="0" r="0" b="0"/>
             <wp:docPr id="1" name="Picture" descr="Figura 1: Representação de uma Rede Densa e uma Rede Densa Profunda"/>
@@ -6968,7 +6968,7 @@
         </w:rPr>
         <w:lastRenderedPageBreak/>
         <w:drawing>
-          <wp:inline distT="0" distB="0" distL="0" distR="0">
+          <wp:inline distT="0" distB="0" distL="0" distR="0" wp14:anchorId="3139B963" wp14:editId="0E89CB55">
             <wp:extent cx="5943600" cy="2060368"/>
             <wp:effectExtent l="0" t="0" r="0" b="0"/>
             <wp:docPr id="2" name="Picture" descr="Figura 2: Representação da evolução temporal de uma Rede Recorrente"/>
@@ -7126,7 +7126,7 @@
           <w:noProof/>
         </w:rPr>
         <w:drawing>
-          <wp:inline distT="0" distB="0" distL="0" distR="0">
+          <wp:inline distT="0" distB="0" distL="0" distR="0" wp14:anchorId="574A307A" wp14:editId="5432A5CA">
             <wp:extent cx="5943600" cy="2270455"/>
             <wp:effectExtent l="0" t="0" r="0" b="0"/>
             <wp:docPr id="3" name="Picture" descr="Figura 3: Representação da evolução temporal de uma Rede Convolucional"/>
@@ -7229,7 +7229,7 @@
           <w:noProof/>
         </w:rPr>
         <w:drawing>
-          <wp:inline distT="0" distB="0" distL="0" distR="0">
+          <wp:inline distT="0" distB="0" distL="0" distR="0" wp14:anchorId="360F1EAF" wp14:editId="7D18F36A">
             <wp:extent cx="3098800" cy="3289300"/>
             <wp:effectExtent l="0" t="0" r="0" b="0"/>
             <wp:docPr id="4" name="Picture" descr="Figura 4: Convolução Bidimensional"/>
@@ -11629,7 +11629,7 @@
           <w:noProof/>
         </w:rPr>
         <w:drawing>
-          <wp:inline distT="0" distB="0" distL="0" distR="0">
+          <wp:inline distT="0" distB="0" distL="0" distR="0" wp14:anchorId="413F3387" wp14:editId="30A88C00">
             <wp:extent cx="5943600" cy="1128744"/>
             <wp:effectExtent l="0" t="0" r="0" b="0"/>
             <wp:docPr id="5" name="Picture" descr="Figura 5: Excitação: 0.1 - Captação: 0.1"/>
@@ -11703,7 +11703,7 @@
           <w:noProof/>
         </w:rPr>
         <w:drawing>
-          <wp:inline distT="0" distB="0" distL="0" distR="0">
+          <wp:inline distT="0" distB="0" distL="0" distR="0" wp14:anchorId="4D0F9A31" wp14:editId="6A9B1A7F">
             <wp:extent cx="5943600" cy="1128744"/>
             <wp:effectExtent l="0" t="0" r="0" b="0"/>
             <wp:docPr id="6" name="Picture" descr="Figura 6: Excitação: 0.1 - Captação: 0.5"/>
@@ -11777,7 +11777,7 @@
           <w:noProof/>
         </w:rPr>
         <w:drawing>
-          <wp:inline distT="0" distB="0" distL="0" distR="0">
+          <wp:inline distT="0" distB="0" distL="0" distR="0" wp14:anchorId="5B546C07" wp14:editId="50C125FA">
             <wp:extent cx="5943600" cy="1128744"/>
             <wp:effectExtent l="0" t="0" r="0" b="0"/>
             <wp:docPr id="7" name="Picture" descr="Figura 7: Excitação: 0.3 - Captação: 0.7"/>
@@ -11851,7 +11851,7 @@
           <w:noProof/>
         </w:rPr>
         <w:drawing>
-          <wp:inline distT="0" distB="0" distL="0" distR="0">
+          <wp:inline distT="0" distB="0" distL="0" distR="0" wp14:anchorId="1CDAD511" wp14:editId="122CC093">
             <wp:extent cx="5943600" cy="1128744"/>
             <wp:effectExtent l="0" t="0" r="0" b="0"/>
             <wp:docPr id="8" name="Picture" descr="Figura 8: Excitação: 0.5 - Captação: 0.1"/>
@@ -11925,7 +11925,7 @@
           <w:noProof/>
         </w:rPr>
         <w:drawing>
-          <wp:inline distT="0" distB="0" distL="0" distR="0">
+          <wp:inline distT="0" distB="0" distL="0" distR="0" wp14:anchorId="59E4813F" wp14:editId="2E3F306B">
             <wp:extent cx="5943600" cy="1128744"/>
             <wp:effectExtent l="0" t="0" r="0" b="0"/>
             <wp:docPr id="9" name="Picture" descr="Figura 9: Excitação: 0.5 - Captação: 0.5"/>
@@ -12049,7 +12049,7 @@
           <w:noProof/>
         </w:rPr>
         <w:drawing>
-          <wp:inline distT="0" distB="0" distL="0" distR="0">
+          <wp:inline distT="0" distB="0" distL="0" distR="0" wp14:anchorId="49314D3D" wp14:editId="036D0B3C">
             <wp:extent cx="5943600" cy="2829153"/>
             <wp:effectExtent l="0" t="0" r="0" b="0"/>
             <wp:docPr id="10" name="Picture" descr="Figura 10: Digital Waveguides"/>
@@ -13415,7 +13415,7 @@
           <w:noProof/>
         </w:rPr>
         <w:drawing>
-          <wp:inline distT="0" distB="0" distL="0" distR="0">
+          <wp:inline distT="0" distB="0" distL="0" distR="0" wp14:anchorId="0954A9C2" wp14:editId="10012A5B">
             <wp:extent cx="5943600" cy="1128744"/>
             <wp:effectExtent l="0" t="0" r="0" b="0"/>
             <wp:docPr id="11" name="Picture" descr="Figura 11: Excitação: 0.1 - Captação: 0.1"/>
@@ -13489,7 +13489,7 @@
           <w:noProof/>
         </w:rPr>
         <w:drawing>
-          <wp:inline distT="0" distB="0" distL="0" distR="0">
+          <wp:inline distT="0" distB="0" distL="0" distR="0" wp14:anchorId="17C2A55A" wp14:editId="214E1B54">
             <wp:extent cx="5943600" cy="1128744"/>
             <wp:effectExtent l="0" t="0" r="0" b="0"/>
             <wp:docPr id="12" name="Picture" descr="Figura 12: Excitação: 0.1 - Captação: 0.5"/>
@@ -13563,7 +13563,7 @@
           <w:noProof/>
         </w:rPr>
         <w:drawing>
-          <wp:inline distT="0" distB="0" distL="0" distR="0">
+          <wp:inline distT="0" distB="0" distL="0" distR="0" wp14:anchorId="4C7B30BE" wp14:editId="2D09D0F3">
             <wp:extent cx="5943600" cy="1128744"/>
             <wp:effectExtent l="0" t="0" r="0" b="0"/>
             <wp:docPr id="13" name="Picture" descr="Figura 13: Excitação: 0.3 - Captação: 0.7"/>
@@ -13637,7 +13637,7 @@
           <w:noProof/>
         </w:rPr>
         <w:drawing>
-          <wp:inline distT="0" distB="0" distL="0" distR="0">
+          <wp:inline distT="0" distB="0" distL="0" distR="0" wp14:anchorId="6CA1D1A4" wp14:editId="16F478D7">
             <wp:extent cx="5943600" cy="1128744"/>
             <wp:effectExtent l="0" t="0" r="0" b="0"/>
             <wp:docPr id="14" name="Picture" descr="Figura 14: Excitação: 0.5 - Captação: 0.1"/>
@@ -13711,7 +13711,7 @@
           <w:noProof/>
         </w:rPr>
         <w:drawing>
-          <wp:inline distT="0" distB="0" distL="0" distR="0">
+          <wp:inline distT="0" distB="0" distL="0" distR="0" wp14:anchorId="3BCC981D" wp14:editId="32F4595E">
             <wp:extent cx="5943600" cy="1128744"/>
             <wp:effectExtent l="0" t="0" r="0" b="0"/>
             <wp:docPr id="15" name="Picture" descr="Figura 15: Excitação: 0.5 - Captação: 0.5"/>
@@ -13818,7 +13818,7 @@
         </w:rPr>
         <w:lastRenderedPageBreak/>
         <w:drawing>
-          <wp:inline distT="0" distB="0" distL="0" distR="0">
+          <wp:inline distT="0" distB="0" distL="0" distR="0" wp14:anchorId="631533E7" wp14:editId="3F750D12">
             <wp:extent cx="5943600" cy="2036618"/>
             <wp:effectExtent l="0" t="0" r="0" b="0"/>
             <wp:docPr id="16" name="Picture" descr="Figura 16: Animação da Corda - Diferenças Finital x Digital Waveguide"/>
@@ -15651,7 +15651,7 @@
         </w:rPr>
         <w:lastRenderedPageBreak/>
         <w:drawing>
-          <wp:inline distT="0" distB="0" distL="0" distR="0">
+          <wp:inline distT="0" distB="0" distL="0" distR="0" wp14:anchorId="08833173" wp14:editId="2C0CCE50">
             <wp:extent cx="5943600" cy="2300173"/>
             <wp:effectExtent l="0" t="0" r="0" b="0"/>
             <wp:docPr id="17" name="Picture" descr="Figura 17: Transformada Discreta Real de Fourier - Interpretação Geométrica da Simetria"/>
@@ -19636,7 +19636,7 @@
           <w:noProof/>
         </w:rPr>
         <w:drawing>
-          <wp:inline distT="0" distB="0" distL="0" distR="0">
+          <wp:inline distT="0" distB="0" distL="0" distR="0" wp14:anchorId="02539C1F" wp14:editId="5C99088F">
             <wp:extent cx="5943600" cy="2754351"/>
             <wp:effectExtent l="0" t="0" r="0" b="0"/>
             <wp:docPr id="18" name="Picture" descr="Figura 18: Representação de um segmento de corda"/>
@@ -22260,7 +22260,7 @@
           <w:noProof/>
         </w:rPr>
         <w:drawing>
-          <wp:inline distT="0" distB="0" distL="0" distR="0">
+          <wp:inline distT="0" distB="0" distL="0" distR="0" wp14:anchorId="75EA31BC" wp14:editId="3482FDB2">
             <wp:extent cx="1905000" cy="1020967"/>
             <wp:effectExtent l="0" t="0" r="0" b="0"/>
             <wp:docPr id="19" name="Picture" descr="Figura 19: representação de uma camada de uma rede"/>
@@ -24971,7 +24971,7 @@
           <w:noProof/>
         </w:rPr>
         <w:drawing>
-          <wp:inline distT="0" distB="0" distL="0" distR="0">
+          <wp:inline distT="0" distB="0" distL="0" distR="0" wp14:anchorId="204B6E02" wp14:editId="08C7FC20">
             <wp:extent cx="3810000" cy="1411003"/>
             <wp:effectExtent l="0" t="0" r="0" b="0"/>
             <wp:docPr id="20" name="Picture" descr="Figura 20: Duas camadas sobrepostas"/>
@@ -28415,7 +28415,7 @@
           <w:noProof/>
         </w:rPr>
         <w:drawing>
-          <wp:inline distT="0" distB="0" distL="0" distR="0">
+          <wp:inline distT="0" distB="0" distL="0" distR="0" wp14:anchorId="7B201058" wp14:editId="181FED11">
             <wp:extent cx="5943600" cy="2653977"/>
             <wp:effectExtent l="0" t="0" r="0" b="0"/>
             <wp:docPr id="21" name="Picture" descr="Figura 21: Adagrad: Loss x Step - 3 camadas ocultas"/>
@@ -28489,7 +28489,7 @@
           <w:noProof/>
         </w:rPr>
         <w:drawing>
-          <wp:inline distT="0" distB="0" distL="0" distR="0">
+          <wp:inline distT="0" distB="0" distL="0" distR="0" wp14:anchorId="1BD66AA3" wp14:editId="0BC5B14E">
             <wp:extent cx="5943600" cy="2635800"/>
             <wp:effectExtent l="0" t="0" r="0" b="0"/>
             <wp:docPr id="22" name="Picture" descr="Figura 22: Adagrad: Loss x Time - 3 camadas ocultas"/>
@@ -29084,7 +29084,7 @@
           <w:noProof/>
         </w:rPr>
         <w:drawing>
-          <wp:inline distT="0" distB="0" distL="0" distR="0">
+          <wp:inline distT="0" distB="0" distL="0" distR="0" wp14:anchorId="3A2FB8C1" wp14:editId="53CF9F86">
             <wp:extent cx="5943600" cy="2337678"/>
             <wp:effectExtent l="0" t="0" r="0" b="0"/>
             <wp:docPr id="23" name="Picture" descr="Figura 23: Nadam: Loss x Step - 3 camadas ocultas"/>
@@ -29153,7 +29153,7 @@
         </w:rPr>
         <w:lastRenderedPageBreak/>
         <w:drawing>
-          <wp:inline distT="0" distB="0" distL="0" distR="0">
+          <wp:inline distT="0" distB="0" distL="0" distR="0" wp14:anchorId="5F27C898" wp14:editId="14476529">
             <wp:extent cx="5943600" cy="2393950"/>
             <wp:effectExtent l="0" t="0" r="0" b="0"/>
             <wp:docPr id="24" name="Picture" descr="Figura 24: Nadam: Loss x Time - 3 camadas ocultas"/>
@@ -29723,7 +29723,7 @@
         </w:rPr>
         <w:lastRenderedPageBreak/>
         <w:drawing>
-          <wp:inline distT="0" distB="0" distL="0" distR="0">
+          <wp:inline distT="0" distB="0" distL="0" distR="0" wp14:anchorId="120085A1" wp14:editId="391319A7">
             <wp:extent cx="5943600" cy="1980094"/>
             <wp:effectExtent l="0" t="0" r="0" b="0"/>
             <wp:docPr id="25" name="Picture" descr="Figura 25: Comparação: Ativações e Otimizadores"/>
@@ -30338,7 +30338,7 @@
           <w:noProof/>
         </w:rPr>
         <w:drawing>
-          <wp:inline distT="0" distB="0" distL="0" distR="0">
+          <wp:inline distT="0" distB="0" distL="0" distR="0" wp14:anchorId="2CCBDCEF" wp14:editId="23E77852">
             <wp:extent cx="5943600" cy="2207282"/>
             <wp:effectExtent l="0" t="0" r="0" b="0"/>
             <wp:docPr id="26" name="Picture" descr="Figura 26: Resultados: Rede Densa"/>
@@ -30471,7 +30471,7 @@
         </w:rPr>
         <w:lastRenderedPageBreak/>
         <w:drawing>
-          <wp:inline distT="0" distB="0" distL="0" distR="0">
+          <wp:inline distT="0" distB="0" distL="0" distR="0" wp14:anchorId="01FF9DD0" wp14:editId="4655D4A2">
             <wp:extent cx="3810000" cy="4280442"/>
             <wp:effectExtent l="0" t="0" r="0" b="0"/>
             <wp:docPr id="27" name="Picture" descr="Figura 27: Topologia RNN"/>
@@ -30566,7 +30566,7 @@
         </w:rPr>
         <w:lastRenderedPageBreak/>
         <w:drawing>
-          <wp:inline distT="0" distB="0" distL="0" distR="0">
+          <wp:inline distT="0" distB="0" distL="0" distR="0" wp14:anchorId="65CB1ACD" wp14:editId="3BD0140C">
             <wp:extent cx="5943600" cy="2013394"/>
             <wp:effectExtent l="0" t="0" r="0" b="0"/>
             <wp:docPr id="28" name="Picture" descr="Figura 28: Resultados Rede Recorrente"/>
@@ -30752,7 +30752,7 @@
         </w:rPr>
         <w:lastRenderedPageBreak/>
         <w:drawing>
-          <wp:inline distT="0" distB="0" distL="0" distR="0">
+          <wp:inline distT="0" distB="0" distL="0" distR="0" wp14:anchorId="389DE794" wp14:editId="1CC9DCBA">
             <wp:extent cx="5943600" cy="4225899"/>
             <wp:effectExtent l="0" t="0" r="0" b="0"/>
             <wp:docPr id="29" name="Picture" descr="Figura 29: Arquitetura - Convolução Alisada"/>
@@ -30934,7 +30934,7 @@
         </w:rPr>
         <w:lastRenderedPageBreak/>
         <w:drawing>
-          <wp:inline distT="0" distB="0" distL="0" distR="0">
+          <wp:inline distT="0" distB="0" distL="0" distR="0" wp14:anchorId="07259BBF" wp14:editId="48D4AF80">
             <wp:extent cx="5943600" cy="3586162"/>
             <wp:effectExtent l="0" t="0" r="0" b="0"/>
             <wp:docPr id="30" name="Picture" descr="Figura 30: Descontinuidades e Transientes"/>
@@ -31088,7 +31088,7 @@
           <w:noProof/>
         </w:rPr>
         <w:drawing>
-          <wp:inline distT="0" distB="0" distL="0" distR="0">
+          <wp:inline distT="0" distB="0" distL="0" distR="0" wp14:anchorId="225D956C" wp14:editId="7B3A147E">
             <wp:extent cx="5943600" cy="1534071"/>
             <wp:effectExtent l="0" t="0" r="0" b="0"/>
             <wp:docPr id="31" name="Picture" descr="Figura 31: Espectro da intensidade das Frequências Audíveis"/>
@@ -31266,7 +31266,7 @@
         </w:rPr>
         <w:lastRenderedPageBreak/>
         <w:drawing>
-          <wp:inline distT="0" distB="0" distL="0" distR="0">
+          <wp:inline distT="0" distB="0" distL="0" distR="0" wp14:anchorId="7E3111D1" wp14:editId="3B857C6E">
             <wp:extent cx="3810000" cy="3183994"/>
             <wp:effectExtent l="0" t="0" r="0" b="0"/>
             <wp:docPr id="32" name="Picture" descr="Figura 32: Arquitetura para a emulação da Caixa de uma Bateria"/>
@@ -31380,7 +31380,7 @@
           <w:noProof/>
         </w:rPr>
         <w:drawing>
-          <wp:inline distT="0" distB="0" distL="0" distR="0">
+          <wp:inline distT="0" distB="0" distL="0" distR="0" wp14:anchorId="0B036B65" wp14:editId="1D3BB698">
             <wp:extent cx="5943600" cy="75014"/>
             <wp:effectExtent l="0" t="0" r="0" b="0"/>
             <wp:docPr id="33" name="Picture" descr="Figura 33: Dinâmicas geradas para Contratempo Aberto - Pianíssimo até Molto Forte"/>
@@ -31518,7 +31518,7 @@
           <w:noProof/>
         </w:rPr>
         <w:drawing>
-          <wp:inline distT="0" distB="0" distL="0" distR="0">
+          <wp:inline distT="0" distB="0" distL="0" distR="0" wp14:anchorId="16D8A1D7" wp14:editId="0FC56690">
             <wp:extent cx="5943600" cy="329871"/>
             <wp:effectExtent l="0" t="0" r="0" b="0"/>
             <wp:docPr id="34" name="Picture" descr="Figura 34: 7 Round-Robins gerados para o Tom 1"/>
@@ -31664,7 +31664,7 @@
         </w:rPr>
         <w:lastRenderedPageBreak/>
         <w:drawing>
-          <wp:inline distT="0" distB="0" distL="0" distR="0">
+          <wp:inline distT="0" distB="0" distL="0" distR="0" wp14:anchorId="22FC514B" wp14:editId="44C77FD0">
             <wp:extent cx="5943600" cy="760544"/>
             <wp:effectExtent l="0" t="0" r="0" b="0"/>
             <wp:docPr id="35" name="Picture" descr="Figura 35: Dinâmica posição do golpe para caixa"/>
@@ -31775,7 +31775,7 @@
           <w:noProof/>
         </w:rPr>
         <w:drawing>
-          <wp:inline distT="0" distB="0" distL="0" distR="0">
+          <wp:inline distT="0" distB="0" distL="0" distR="0" wp14:anchorId="347F3909" wp14:editId="0FBBEC62">
             <wp:extent cx="5943600" cy="2002993"/>
             <wp:effectExtent l="0" t="0" r="0" b="0"/>
             <wp:docPr id="36" name="Picture" descr="Figura 36: Experimento Emulação da Voz Cantada"/>
@@ -31889,7 +31889,7 @@
           <w:noProof/>
         </w:rPr>
         <w:drawing>
-          <wp:inline distT="0" distB="0" distL="0" distR="0">
+          <wp:inline distT="0" distB="0" distL="0" distR="0" wp14:anchorId="37682479" wp14:editId="314C0AA1">
             <wp:extent cx="5943600" cy="2559780"/>
             <wp:effectExtent l="0" t="0" r="0" b="0"/>
             <wp:docPr id="37" name="Picture" descr="Figura 37: Efeito do Decaimento sobre a Tranformada de Fourier: Senoide 440hz"/>
@@ -32014,7 +32014,7 @@
           <w:noProof/>
         </w:rPr>
         <w:drawing>
-          <wp:inline distT="0" distB="0" distL="0" distR="0">
+          <wp:inline distT="0" distB="0" distL="0" distR="0" wp14:anchorId="4D407FB4" wp14:editId="3E700597">
             <wp:extent cx="5943600" cy="1640433"/>
             <wp:effectExtent l="0" t="0" r="0" b="0"/>
             <wp:docPr id="38" name="Picture" descr="Figura 38: Onda composta por senoides a 110, 220 e 330hz"/>
@@ -32349,7 +32349,7 @@
           <w:noProof/>
         </w:rPr>
         <w:drawing>
-          <wp:inline distT="0" distB="0" distL="0" distR="0">
+          <wp:inline distT="0" distB="0" distL="0" distR="0" wp14:anchorId="6A934C97" wp14:editId="2FEE3BC9">
             <wp:extent cx="5943600" cy="1188720"/>
             <wp:effectExtent l="0" t="0" r="0" b="0"/>
             <wp:docPr id="39" name="Picture" descr="Figura 39: Picos e Valores Máximos - Piano, tecla 35"/>
@@ -32925,7 +32925,7 @@
           <w:noProof/>
         </w:rPr>
         <w:drawing>
-          <wp:inline distT="0" distB="0" distL="0" distR="0">
+          <wp:inline distT="0" distB="0" distL="0" distR="0" wp14:anchorId="61785C51" wp14:editId="617A8882">
             <wp:extent cx="5943600" cy="1693926"/>
             <wp:effectExtent l="0" t="0" r="0" b="0"/>
             <wp:docPr id="40" name="Picture" descr="Figura 40: Decaimentos Estimados"/>
@@ -33167,7 +33167,7 @@
           <w:noProof/>
         </w:rPr>
         <w:drawing>
-          <wp:inline distT="0" distB="0" distL="0" distR="0">
+          <wp:inline distT="0" distB="0" distL="0" distR="0" wp14:anchorId="34D3D172" wp14:editId="3D16E3AC">
             <wp:extent cx="5943600" cy="2799435"/>
             <wp:effectExtent l="0" t="0" r="0" b="0"/>
             <wp:docPr id="41" name="Picture" descr="Figura 41: inarmonicidades"/>
@@ -33290,7 +33290,7 @@
         </w:rPr>
         <w:lastRenderedPageBreak/>
         <w:drawing>
-          <wp:inline distT="0" distB="0" distL="0" distR="0">
+          <wp:inline distT="0" distB="0" distL="0" distR="0" wp14:anchorId="32290E7C" wp14:editId="6C1D6C15">
             <wp:extent cx="5943600" cy="1188720"/>
             <wp:effectExtent l="0" t="0" r="0" b="0"/>
             <wp:docPr id="42" name="Picture" descr="Figura 42: Decaimentos Máximos por Notas"/>
@@ -33374,7 +33374,7 @@
           <w:noProof/>
         </w:rPr>
         <w:drawing>
-          <wp:inline distT="0" distB="0" distL="0" distR="0">
+          <wp:inline distT="0" distB="0" distL="0" distR="0" wp14:anchorId="3FC854F2" wp14:editId="036F9060">
             <wp:extent cx="5943600" cy="1188720"/>
             <wp:effectExtent l="0" t="0" r="0" b="0"/>
             <wp:docPr id="43" name="Picture" descr="Figura 43: Amplitudes Máximas por Notas"/>
@@ -33576,7 +33576,7 @@
           <w:noProof/>
         </w:rPr>
         <w:drawing>
-          <wp:inline distT="0" distB="0" distL="0" distR="0">
+          <wp:inline distT="0" distB="0" distL="0" distR="0" wp14:anchorId="6A0258C9" wp14:editId="771513C6">
             <wp:extent cx="5943600" cy="1884121"/>
             <wp:effectExtent l="0" t="0" r="0" b="0"/>
             <wp:docPr id="44" name="Picture" descr="Figura 44: Previsões - Modelo Misto"/>
@@ -44548,7 +44548,7 @@
 </file>
 
 <file path=customXml/itemProps1.xml><?xml version="1.0" encoding="utf-8"?>
-<ds:datastoreItem xmlns:ds="http://schemas.openxmlformats.org/officeDocument/2006/customXml" ds:itemID="{AC9EF63E-7E86-4219-9373-0FCAEDB01CDD}">
+<ds:datastoreItem xmlns:ds="http://schemas.openxmlformats.org/officeDocument/2006/customXml" ds:itemID="{2A178ED4-1624-4896-9D0D-BA33B533C54F}">
   <ds:schemaRefs>
     <ds:schemaRef ds:uri="http://schemas.openxmlformats.org/officeDocument/2006/bibliography"/>
   </ds:schemaRefs>

</xml_diff>